<commit_message>
Ispravka SSU dokumenata na osnovu izvestaja o defektima
Change-Id: Iac75ebb07118e8e0194164cde25ade73127dc49b
</commit_message>
<xml_diff>
--- a/docs/SSU/Dodeljeni_radni_zadaci_i_promena_statusa.docx
+++ b/docs/SSU/Dodeljeni_radni_zadaci_i_promena_statusa.docx
@@ -556,12 +556,6 @@
         <w:gridCol w:w="2352"/>
       </w:tblGrid>
       <w:tr>
-        <w:tblPrEx>
-          <w:tblCellMar>
-            <w:top w:w="0" w:type="dxa"/>
-            <w:bottom w:w="0" w:type="dxa"/>
-          </w:tblCellMar>
-        </w:tblPrEx>
         <w:tc>
           <w:tcPr>
             <w:tcW w:w="2351" w:type="dxa"/>
@@ -696,12 +690,6 @@
         </w:tc>
       </w:tr>
       <w:tr>
-        <w:tblPrEx>
-          <w:tblCellMar>
-            <w:top w:w="0" w:type="dxa"/>
-            <w:bottom w:w="0" w:type="dxa"/>
-          </w:tblCellMar>
-        </w:tblPrEx>
         <w:tc>
           <w:tcPr>
             <w:tcW w:w="2351" w:type="dxa"/>
@@ -2150,12 +2138,6 @@
         <w:gridCol w:w="3135"/>
       </w:tblGrid>
       <w:tr>
-        <w:tblPrEx>
-          <w:tblCellMar>
-            <w:top w:w="0" w:type="dxa"/>
-            <w:bottom w:w="0" w:type="dxa"/>
-          </w:tblCellMar>
-        </w:tblPrEx>
         <w:tc>
           <w:tcPr>
             <w:tcW w:w="3135" w:type="dxa"/>
@@ -2264,12 +2246,6 @@
         </w:tc>
       </w:tr>
       <w:tr>
-        <w:tblPrEx>
-          <w:tblCellMar>
-            <w:top w:w="0" w:type="dxa"/>
-            <w:bottom w:w="0" w:type="dxa"/>
-          </w:tblCellMar>
-        </w:tblPrEx>
         <w:tc>
           <w:tcPr>
             <w:tcW w:w="3135" w:type="dxa"/>
@@ -2414,12 +2390,6 @@
         </w:tc>
       </w:tr>
       <w:tr>
-        <w:tblPrEx>
-          <w:tblCellMar>
-            <w:top w:w="0" w:type="dxa"/>
-            <w:bottom w:w="0" w:type="dxa"/>
-          </w:tblCellMar>
-        </w:tblPrEx>
         <w:tc>
           <w:tcPr>
             <w:tcW w:w="3135" w:type="dxa"/>
@@ -2575,12 +2545,6 @@
         </w:tc>
       </w:tr>
       <w:tr>
-        <w:tblPrEx>
-          <w:tblCellMar>
-            <w:top w:w="0" w:type="dxa"/>
-            <w:bottom w:w="0" w:type="dxa"/>
-          </w:tblCellMar>
-        </w:tblPrEx>
         <w:tc>
           <w:tcPr>
             <w:tcW w:w="3135" w:type="dxa"/>
@@ -3193,7 +3157,23 @@
       </w:r>
       <w:proofErr w:type="spellStart"/>
       <w:r>
+        <w:t>prioritetu</w:t>
+      </w:r>
+      <w:proofErr w:type="spellEnd"/>
+      <w:r>
+        <w:t xml:space="preserve">, </w:t>
+      </w:r>
+      <w:proofErr w:type="spellStart"/>
+      <w:r>
         <w:t>roku</w:t>
+      </w:r>
+      <w:proofErr w:type="spellEnd"/>
+      <w:r>
+        <w:t xml:space="preserve"> </w:t>
+      </w:r>
+      <w:proofErr w:type="spellStart"/>
+      <w:r>
+        <w:t>izvršenja</w:t>
       </w:r>
       <w:proofErr w:type="spellEnd"/>
       <w:r>
@@ -3547,25 +3527,12 @@
         </w:numPr>
         <w:spacing w:after="60" w:line="276" w:lineRule="auto"/>
       </w:pPr>
-      <w:proofErr w:type="spellStart"/>
-      <w:r>
-        <w:t>Zaposleni</w:t>
-      </w:r>
-      <w:proofErr w:type="spellEnd"/>
-      <w:r>
-        <w:t xml:space="preserve"> </w:t>
-      </w:r>
-      <w:proofErr w:type="spellStart"/>
-      <w:r>
-        <w:t>bira</w:t>
-      </w:r>
-      <w:proofErr w:type="spellEnd"/>
-      <w:r>
-        <w:t xml:space="preserve"> </w:t>
-      </w:r>
-      <w:proofErr w:type="spellStart"/>
-      <w:r>
-        <w:t>jedan</w:t>
+      <w:r>
+        <w:t xml:space="preserve">Za </w:t>
+      </w:r>
+      <w:proofErr w:type="spellStart"/>
+      <w:r>
+        <w:t>svaki</w:t>
       </w:r>
       <w:proofErr w:type="spellEnd"/>
       <w:r>
@@ -3581,19 +3548,83 @@
       </w:r>
       <w:proofErr w:type="spellStart"/>
       <w:r>
-        <w:t>sa</w:t>
-      </w:r>
-      <w:proofErr w:type="spellEnd"/>
-      <w:r>
-        <w:t xml:space="preserve"> </w:t>
-      </w:r>
-      <w:proofErr w:type="spellStart"/>
-      <w:r>
-        <w:t>liste</w:t>
-      </w:r>
-      <w:proofErr w:type="spellEnd"/>
-      <w:r>
-        <w:t>.</w:t>
+        <w:t>sistem</w:t>
+      </w:r>
+      <w:proofErr w:type="spellEnd"/>
+      <w:r>
+        <w:t xml:space="preserve"> </w:t>
+      </w:r>
+      <w:proofErr w:type="spellStart"/>
+      <w:r>
+        <w:t>prikazuje</w:t>
+      </w:r>
+      <w:proofErr w:type="spellEnd"/>
+      <w:r>
+        <w:t xml:space="preserve"> </w:t>
+      </w:r>
+      <w:proofErr w:type="spellStart"/>
+      <w:r>
+        <w:t>naziv</w:t>
+      </w:r>
+      <w:proofErr w:type="spellEnd"/>
+      <w:r>
+        <w:t xml:space="preserve">, </w:t>
+      </w:r>
+      <w:proofErr w:type="spellStart"/>
+      <w:r>
+        <w:t>kratak</w:t>
+      </w:r>
+      <w:proofErr w:type="spellEnd"/>
+      <w:r>
+        <w:t xml:space="preserve"> </w:t>
+      </w:r>
+      <w:proofErr w:type="spellStart"/>
+      <w:r>
+        <w:t>opis</w:t>
+      </w:r>
+      <w:proofErr w:type="spellEnd"/>
+      <w:r>
+        <w:t xml:space="preserve">, </w:t>
+      </w:r>
+      <w:proofErr w:type="spellStart"/>
+      <w:r>
+        <w:t>prioritet</w:t>
+      </w:r>
+      <w:proofErr w:type="spellEnd"/>
+      <w:r>
+        <w:t xml:space="preserve">, </w:t>
+      </w:r>
+      <w:proofErr w:type="spellStart"/>
+      <w:r>
+        <w:t>rok</w:t>
+      </w:r>
+      <w:proofErr w:type="spellEnd"/>
+      <w:r>
+        <w:t xml:space="preserve"> </w:t>
+      </w:r>
+      <w:proofErr w:type="spellStart"/>
+      <w:r>
+        <w:t>izvršenja</w:t>
+      </w:r>
+      <w:proofErr w:type="spellEnd"/>
+      <w:r>
+        <w:t xml:space="preserve"> </w:t>
+      </w:r>
+      <w:proofErr w:type="spellStart"/>
+      <w:r>
+        <w:t>i</w:t>
+      </w:r>
+      <w:proofErr w:type="spellEnd"/>
+      <w:r>
+        <w:t xml:space="preserve"> </w:t>
+      </w:r>
+      <w:proofErr w:type="spellStart"/>
+      <w:r>
+        <w:t>trenutni</w:t>
+      </w:r>
+      <w:proofErr w:type="spellEnd"/>
+      <w:r>
+        <w:t xml:space="preserve"> status.</w:t>
       </w:r>
     </w:p>
     <w:p>
@@ -3607,59 +3638,51 @@
       </w:pPr>
       <w:proofErr w:type="spellStart"/>
       <w:r>
-        <w:t>Sistem</w:t>
-      </w:r>
-      <w:proofErr w:type="spellEnd"/>
-      <w:r>
-        <w:t xml:space="preserve"> </w:t>
-      </w:r>
-      <w:proofErr w:type="spellStart"/>
-      <w:r>
-        <w:t>prikazuje</w:t>
-      </w:r>
-      <w:proofErr w:type="spellEnd"/>
-      <w:r>
-        <w:t xml:space="preserve"> </w:t>
-      </w:r>
-      <w:proofErr w:type="spellStart"/>
-      <w:r>
-        <w:t>detalje</w:t>
-      </w:r>
-      <w:proofErr w:type="spellEnd"/>
-      <w:r>
-        <w:t xml:space="preserve"> </w:t>
-      </w:r>
-      <w:proofErr w:type="spellStart"/>
-      <w:r>
-        <w:t>zadatka</w:t>
-      </w:r>
-      <w:proofErr w:type="spellEnd"/>
-      <w:r>
-        <w:t xml:space="preserve"> </w:t>
-      </w:r>
-      <w:proofErr w:type="spellStart"/>
-      <w:r>
-        <w:t>i</w:t>
-      </w:r>
-      <w:proofErr w:type="spellEnd"/>
-      <w:r>
-        <w:t xml:space="preserve"> </w:t>
-      </w:r>
-      <w:proofErr w:type="spellStart"/>
-      <w:r>
-        <w:t>njegov</w:t>
-      </w:r>
-      <w:proofErr w:type="spellEnd"/>
-      <w:r>
-        <w:t xml:space="preserve"> </w:t>
-      </w:r>
-      <w:proofErr w:type="spellStart"/>
-      <w:r>
-        <w:t>trenutni</w:t>
-      </w:r>
-      <w:proofErr w:type="spellEnd"/>
-      <w:r>
-        <w:t xml:space="preserve"> status.</w:t>
+        <w:t>Zaposleni</w:t>
+      </w:r>
+      <w:proofErr w:type="spellEnd"/>
+      <w:r>
+        <w:t xml:space="preserve"> </w:t>
+      </w:r>
+      <w:proofErr w:type="spellStart"/>
+      <w:r>
+        <w:t>bira</w:t>
+      </w:r>
+      <w:proofErr w:type="spellEnd"/>
+      <w:r>
+        <w:t xml:space="preserve"> </w:t>
+      </w:r>
+      <w:proofErr w:type="spellStart"/>
+      <w:r>
+        <w:t>jedan</w:t>
+      </w:r>
+      <w:proofErr w:type="spellEnd"/>
+      <w:r>
+        <w:t xml:space="preserve"> </w:t>
+      </w:r>
+      <w:proofErr w:type="spellStart"/>
+      <w:r>
+        <w:t>zadatak</w:t>
+      </w:r>
+      <w:proofErr w:type="spellEnd"/>
+      <w:r>
+        <w:t xml:space="preserve"> </w:t>
+      </w:r>
+      <w:proofErr w:type="spellStart"/>
+      <w:r>
+        <w:t>sa</w:t>
+      </w:r>
+      <w:proofErr w:type="spellEnd"/>
+      <w:r>
+        <w:t xml:space="preserve"> </w:t>
+      </w:r>
+      <w:proofErr w:type="spellStart"/>
+      <w:r>
+        <w:t>liste</w:t>
+      </w:r>
+      <w:proofErr w:type="spellEnd"/>
+      <w:r>
+        <w:t>.</w:t>
       </w:r>
     </w:p>
     <w:p>
@@ -3674,6 +3697,72 @@
       <w:proofErr w:type="spellStart"/>
       <w:r>
         <w:lastRenderedPageBreak/>
+        <w:t>Sistem</w:t>
+      </w:r>
+      <w:proofErr w:type="spellEnd"/>
+      <w:r>
+        <w:t xml:space="preserve"> </w:t>
+      </w:r>
+      <w:proofErr w:type="spellStart"/>
+      <w:r>
+        <w:t>prikazuje</w:t>
+      </w:r>
+      <w:proofErr w:type="spellEnd"/>
+      <w:r>
+        <w:t xml:space="preserve"> </w:t>
+      </w:r>
+      <w:proofErr w:type="spellStart"/>
+      <w:r>
+        <w:t>detalje</w:t>
+      </w:r>
+      <w:proofErr w:type="spellEnd"/>
+      <w:r>
+        <w:t xml:space="preserve"> </w:t>
+      </w:r>
+      <w:proofErr w:type="spellStart"/>
+      <w:r>
+        <w:t>zadatka</w:t>
+      </w:r>
+      <w:proofErr w:type="spellEnd"/>
+      <w:r>
+        <w:t xml:space="preserve"> </w:t>
+      </w:r>
+      <w:proofErr w:type="spellStart"/>
+      <w:r>
+        <w:t>i</w:t>
+      </w:r>
+      <w:proofErr w:type="spellEnd"/>
+      <w:r>
+        <w:t xml:space="preserve"> </w:t>
+      </w:r>
+      <w:proofErr w:type="spellStart"/>
+      <w:r>
+        <w:t>njegov</w:t>
+      </w:r>
+      <w:proofErr w:type="spellEnd"/>
+      <w:r>
+        <w:t xml:space="preserve"> </w:t>
+      </w:r>
+      <w:proofErr w:type="spellStart"/>
+      <w:r>
+        <w:t>trenutni</w:t>
+      </w:r>
+      <w:proofErr w:type="spellEnd"/>
+      <w:r>
+        <w:t xml:space="preserve"> status.</w:t>
+      </w:r>
+    </w:p>
+    <w:p>
+      <w:pPr>
+        <w:pStyle w:val="ListParagraph"/>
+        <w:numPr>
+          <w:ilvl w:val="0"/>
+          <w:numId w:val="3"/>
+        </w:numPr>
+        <w:spacing w:after="60" w:line="276" w:lineRule="auto"/>
+      </w:pPr>
+      <w:proofErr w:type="spellStart"/>
+      <w:r>
         <w:t>Zaposleni</w:t>
       </w:r>
       <w:proofErr w:type="spellEnd"/>
@@ -6148,7 +6237,6 @@
   <w:style w:type="character" w:default="1" w:styleId="DefaultParagraphFont">
     <w:name w:val="Default Paragraph Font"/>
     <w:uiPriority w:val="1"/>
-    <w:semiHidden/>
     <w:unhideWhenUsed/>
   </w:style>
   <w:style w:type="table" w:default="1" w:styleId="TableNormal">

</xml_diff>